<commit_message>
docs(examples/word): migrate textbox scenarios to high-level API; fix stale border note
textbox: 8 of the 10 scenarios (all but per-run mixed formatting and the
nested table) now build via `add --type textbox` + inner-paragraph `set`
instead of raw-set DrawingML — exercising fill/border/gradient/rotation/
vertical text/geometry/cornerRadius/shadow/no-fill/wrap/positioning/z-order.
Only scenarios 2 and 3 remain on raw-set. Updated .sh, .py (SDK batch twin),
.md and regenerated textbox.docx.

paragraph-formatting: correct the stale comment claiming per-side `border.top`
is reported unsupported (it works and is silent), and add a top+bottom
per-side border example. Updated .sh/.py/.md and regenerated the .docx.
</commit_message>
<xml_diff>
--- a/examples/word/paragraph-formatting.docx
+++ b/examples/word/paragraph-formatting.docx
@@ -652,6 +652,18 @@
       <w:r>
         <w:rPr/>
         <w:t xml:space="preserve">Red 1pt box (style;size;color)</w:t>
+      </w:r>
+    </w:p>
+    <w:p>
+      <w:pPr>
+        <w:pBdr>
+          <w:top w:val="single" w:color="0070C0" w:sz="8"/>
+          <w:bottom w:val="single" w:color="0070C0" w:sz="8"/>
+        </w:pBdr>
+      </w:pPr>
+      <w:r>
+        <w:rPr/>
+        <w:t xml:space="preserve">Per-side: top + bottom only (rule above and below)</w:t>
       </w:r>
     </w:p>
     <w:p>

</xml_diff>